<commit_message>
docs: final polish before submission
- Remove inline Highlights from manuscript (separate file submitted)
- Change "state-of-the-art (SOTA)" to "benchmark result" in Section 2.2
- Deduplicate "supporting operational diversity as" in Abstract/Intro

Co-Authored-By: Claude Opus 4.6 <noreply@anthropic.com>
</commit_message>
<xml_diff>
--- a/docs/paper_ae.docx
+++ b/docs/paper_ae.docx
@@ -130,7 +130,7 @@
           <w:rFonts w:ascii="Times New Roman" w:hAnsi="Times New Roman" w:eastAsia="Times New Roman"/>
           <w:sz w:val="24"/>
         </w:rPr>
-        <w:t xml:space="preserve">Zero-shot building load forecasting—predicting energy consumption for unseen buildings without retraining—is essential for grid balancing and demand response, yet current approaches assume that large-scale synthetic corpora are required. We show that carefully designed operational diversity, rather than corpus scale alone, is sufficient for high-accuracy zero-shot forecasting. A Transformer trained on only 700 Korean-weather EnergyPlus simulations—fifty per archetype across 14 building types—with operational schedules sampled via 12-dimensional Latin Hypercube Sampling (LHS), Reversible Instance Normalization (RevIN), and no geographic features reaches BuildingsBench-level performance on 955 real U.S. commercial buildings and Portuguese electricity consumers, achieving 13.11 ± 0.17% NRMSE (five-seed mean), numerically below the reproduced 900,000-building baseline of 13.27%. Controlled experiments at matched scale consistently favor the LHS-designed corpus over matched BB-700 controls, supporting operational diversity as a primary driver beyond RevIN or augmentation alone. Applying RevIN to the full 900K corpus degrades performance in a single-run comparison, suggesting that RevIN’s benefit is regime-dependent rather than universal. N-scaling saturates rapidly: 70 buildings already reach the benchmark level. A U.S.-weather ablation remains competitive and still outperforms the matched BB-700 control, supporting operational diversity as a major driver while revealing residual weather sensitivity.</w:t>
+        <w:t xml:space="preserve">Zero-shot building load forecasting—predicting energy consumption for unseen buildings without retraining—is essential for grid balancing and demand response, yet current approaches assume that large-scale synthetic corpora are required. We show that carefully designed operational diversity, rather than corpus scale alone, is sufficient for high-accuracy zero-shot forecasting. A Transformer trained on only 700 Korean-weather EnergyPlus simulations—fifty per archetype across 14 building types—with operational schedules sampled via 12-dimensional Latin Hypercube Sampling (LHS), Reversible Instance Normalization (RevIN), and no geographic features reaches BuildingsBench-level performance on 955 real U.S. commercial buildings and Portuguese electricity consumers, achieving 13.11 ± 0.17% NRMSE (five-seed mean), numerically below the reproduced 900,000-building baseline of 13.27%. Controlled experiments at matched scale consistently favor the LHS-designed corpus over matched BB-700 controls, supporting operational diversity as a primary driver beyond RevIN or augmentation alone. Applying RevIN to the full 900K corpus degrades performance in a single-run comparison, suggesting that RevIN’s benefit is regime-dependent rather than universal. N-scaling saturates rapidly: 70 buildings already reach the benchmark level. A U.S.-weather ablation remains competitive and still outperforms the matched BB-700 control, indicating that the conclusion is not solely a Korean-weather artifact while revealing residual weather sensitivity.</w:t>
       </w:r>
     </w:p>
     <w:p>
@@ -153,84 +153,6 @@
           <w:sz w:val="24"/>
         </w:rPr>
         <w:t xml:space="preserve">: building energy forecasting, zero-shot learning, foundation models, parametric simulation, data-centric AI, reversible instance normalization</w:t>
-      </w:r>
-    </w:p>
-    <w:p>
-      <w:pPr>
-        <w:pStyle w:val="BodyText"/>
-        <w:spacing w:line="480" w:lineRule="auto" w:after="0" w:before="0"/>
-      </w:pPr>
-      <w:r>
-        <w:rPr>
-          <w:rFonts w:ascii="Times New Roman" w:hAnsi="Times New Roman" w:eastAsia="Times New Roman"/>
-          <w:b/>
-          <w:bCs/>
-          <w:sz w:val="24"/>
-        </w:rPr>
-        <w:t xml:space="preserve">Highlights</w:t>
-      </w:r>
-      <w:r>
-        <w:rPr>
-          <w:rFonts w:ascii="Times New Roman" w:hAnsi="Times New Roman" w:eastAsia="Times New Roman"/>
-          <w:sz w:val="24"/>
-        </w:rPr>
-        <w:t xml:space="preserve">:</w:t>
-      </w:r>
-      <w:r>
-        <w:rPr>
-          <w:rFonts w:ascii="Times New Roman" w:hAnsi="Times New Roman" w:eastAsia="Times New Roman"/>
-          <w:sz w:val="24"/>
-        </w:rPr>
-        <w:t xml:space="preserve"> </w:t>
-      </w:r>
-      <w:r>
-        <w:rPr>
-          <w:rFonts w:ascii="Times New Roman" w:hAnsi="Times New Roman" w:eastAsia="Times New Roman"/>
-          <w:sz w:val="24"/>
-        </w:rPr>
-        <w:t xml:space="preserve">- 700 simulations reach benchmark-level accuracy using no geographic metadata</w:t>
-      </w:r>
-      <w:r>
-        <w:rPr>
-          <w:rFonts w:ascii="Times New Roman" w:hAnsi="Times New Roman" w:eastAsia="Times New Roman"/>
-          <w:sz w:val="24"/>
-        </w:rPr>
-        <w:t xml:space="preserve"> </w:t>
-      </w:r>
-      <w:r>
-        <w:rPr>
-          <w:rFonts w:ascii="Times New Roman" w:hAnsi="Times New Roman" w:eastAsia="Times New Roman"/>
-          <w:sz w:val="24"/>
-        </w:rPr>
-        <w:t xml:space="preserve">- 12D Latin Hypercube Sampling yields operational diversity over stock-model scale</w:t>
-      </w:r>
-      <w:r>
-        <w:rPr>
-          <w:rFonts w:ascii="Times New Roman" w:hAnsi="Times New Roman" w:eastAsia="Times New Roman"/>
-          <w:sz w:val="24"/>
-        </w:rPr>
-        <w:t xml:space="preserve"> </w:t>
-      </w:r>
-      <w:r>
-        <w:rPr>
-          <w:rFonts w:ascii="Times New Roman" w:hAnsi="Times New Roman" w:eastAsia="Times New Roman"/>
-          <w:sz w:val="24"/>
-        </w:rPr>
-        <w:t xml:space="preserve">- RevIN helps 700-building models but degrades BB-900K retraining</w:t>
-      </w:r>
-      <w:r>
-        <w:rPr>
-          <w:rFonts w:ascii="Times New Roman" w:hAnsi="Times New Roman" w:eastAsia="Times New Roman"/>
-          <w:sz w:val="24"/>
-        </w:rPr>
-        <w:t xml:space="preserve"> </w:t>
-      </w:r>
-      <w:r>
-        <w:rPr>
-          <w:rFonts w:ascii="Times New Roman" w:hAnsi="Times New Roman" w:eastAsia="Times New Roman"/>
-          <w:sz w:val="24"/>
-        </w:rPr>
-        <w:t xml:space="preserve">- Korean-weather training transfers zero-shot to U.S./Portuguese real buildings</w:t>
       </w:r>
     </w:p>
     <w:p>
@@ -340,7 +262,7 @@
           <w:rFonts w:ascii="Times New Roman" w:hAnsi="Times New Roman" w:eastAsia="Times New Roman"/>
           <w:sz w:val="24"/>
         </w:rPr>
-        <w:t xml:space="preserve">Controlled experiments on matched 700-building subsets—one from our parametric simulations, one from BuildingsBench—show that the improvement cannot be attributed to RevIN alone and is strongly linked to data design. Applying RevIN to the full 900K BuildingsBench corpus worsens performance, an asymmetry suggesting that RevIN is beneficial in small-data regimes but not universally helpful at scale. The n-scaling curve shows that 70 buildings already reach the benchmark level. A U.S.-weather/LHS ablation—retraining on the same 700 LHS schedules with U.S. TMY weather—still outperforms the matched BB-700 control, supporting operational diversity as a major driver while revealing residual weather sensitivity.</w:t>
+        <w:t xml:space="preserve">Controlled experiments on matched 700-building subsets—one from our parametric simulations, one from BuildingsBench—show that the improvement cannot be attributed to RevIN alone and is strongly linked to data design. Applying RevIN to the full 900K BuildingsBench corpus worsens performance, an asymmetry suggesting that RevIN is beneficial in small-data regimes but not universally helpful at scale. The n-scaling curve shows that 70 buildings already reach the benchmark level. A U.S.-weather/LHS ablation—retraining on the same 700 LHS schedules with U.S. TMY weather—still outperforms the matched BB-700 control, indicating that the conclusion is not solely a Korean-weather artifact while revealing residual weather sensitivity.</w:t>
       </w:r>
     </w:p>
     <w:p>
@@ -592,7 +514,7 @@
           <w:rFonts w:ascii="Times New Roman" w:hAnsi="Times New Roman" w:eastAsia="Times New Roman"/>
           <w:sz w:val="24"/>
         </w:rPr>
-        <w:t xml:space="preserve">BuildingsBench [3] framed building load forecasting as a zero-shot generalization problem. The training corpus, Buildings-900K, comprises approximately 350,000 commercial (ComStock) and 550,000 residential (ResStock) synthetic buildings with hourly electricity consumption generated by the NREL EULP pipeline [4]. The model—an encoder-decoder Transformer predicting 24-hour Gaussian distributions from 168-hour context—trains for a fraction of one epoch (approximately 0.067 epochs by our calculation, equivalent to roughly 2–3 sampled training windows per building on average) using a fitted global Box-Cox normalization (λ = −0.067, as measured from the provided checkpoint). The reported state-of-the-art (SOTA) is 13.28% median NRMSE on commercial buildings. Our work keeps the model architecture and evaluation protocol fixed while changing the training data and normalization strategy.</w:t>
+        <w:t xml:space="preserve">BuildingsBench [3] framed building load forecasting as a zero-shot generalization problem. The training corpus, Buildings-900K, comprises approximately 350,000 commercial (ComStock) and 550,000 residential (ResStock) synthetic buildings with hourly electricity consumption generated by the NREL EULP pipeline [4]. The model—an encoder-decoder Transformer predicting 24-hour Gaussian distributions from 168-hour context—trains for a fraction of one epoch (approximately 0.067 epochs by our calculation, equivalent to roughly 2–3 sampled training windows per building on average) using a fitted global Box-Cox normalization (λ = −0.067, as measured from the provided checkpoint). The reported benchmark result is 13.28% median NRMSE on commercial buildings. Our work keeps the model architecture and evaluation protocol fixed while changing the training data and normalization strategy.</w:t>
       </w:r>
     </w:p>
     <w:p>

</xml_diff>

<commit_message>
docs: update status after Applied Energy submission (APEN-S-26-12975)
Paper submitted to Applied Energy on 2026-05-04. Update PAPER_PLAN
status, add US-TMY metadata to catalog, and include Exp-039 results.

Co-Authored-By: Claude Opus 4.6 <noreply@anthropic.com>
</commit_message>
<xml_diff>
--- a/docs/paper_ae.docx
+++ b/docs/paper_ae.docx
@@ -2,7 +2,7 @@
 <file path=word/document.xml><?xml version="1.0" encoding="utf-8"?>
 <w:document xmlns:w="http://schemas.openxmlformats.org/wordprocessingml/2006/main" xmlns:m="http://schemas.openxmlformats.org/officeDocument/2006/math" xmlns:r="http://schemas.openxmlformats.org/officeDocument/2006/relationships" xmlns:o="urn:schemas-microsoft-com:office:office" xmlns:v="urn:schemas-microsoft-com:vml" xmlns:w10="urn:schemas-microsoft-com:office:word" xmlns:a="http://schemas.openxmlformats.org/drawingml/2006/main" xmlns:pic="http://schemas.openxmlformats.org/drawingml/2006/picture" xmlns:wp="http://schemas.openxmlformats.org/drawingml/2006/wordprocessingDrawing">
   <w:body>
-    <w:bookmarkStart w:id="46" w:name="X64cda2f792497c7ff91792d0bdc6bcf3828ab8a"/>
+    <w:bookmarkStart w:id="47" w:name="X64cda2f792497c7ff91792d0bdc6bcf3828ab8a"/>
     <w:p>
       <w:pPr>
         <w:pStyle w:val="Heading1"/>
@@ -6286,7 +6286,7 @@
       </w:r>
     </w:p>
     <w:bookmarkEnd w:id="35"/>
-    <w:bookmarkStart w:id="36" w:name="references"/>
+    <w:bookmarkStart w:id="36" w:name="X1f74eb43af444059c7518034463b6c89b1cacf4"/>
     <w:p>
       <w:pPr>
         <w:pStyle w:val="Heading2"/>
@@ -6300,7 +6300,7 @@
           <w:i w:val="0"/>
           <w:sz w:val="26"/>
         </w:rPr>
-        <w:t xml:space="preserve">References</w:t>
+        <w:t xml:space="preserve">Declaration of Generative AI and AI-Assisted Technologies in the Manuscript Preparation Process</w:t>
       </w:r>
     </w:p>
     <w:p>
@@ -6313,345 +6313,7 @@
           <w:rFonts w:ascii="Times New Roman" w:hAnsi="Times New Roman" w:eastAsia="Times New Roman"/>
           <w:sz w:val="24"/>
         </w:rPr>
-        <w:t xml:space="preserve">[1] Fan C, et al. A short-term building cooling load prediction method using deep learning algorithms. Appl Energy 2017;195:222–33.</w:t>
-      </w:r>
-    </w:p>
-    <w:p>
-      <w:pPr>
-        <w:pStyle w:val="BodyText"/>
-        <w:spacing w:line="480" w:lineRule="auto" w:after="0" w:before="0"/>
-      </w:pPr>
-      <w:r>
-        <w:rPr>
-          <w:rFonts w:ascii="Times New Roman" w:hAnsi="Times New Roman" w:eastAsia="Times New Roman"/>
-          <w:sz w:val="24"/>
-        </w:rPr>
-        <w:t xml:space="preserve">[2] Hong T, et al. Ten questions on urban building energy modeling. Build Environ 2019;168:106508.</w:t>
-      </w:r>
-    </w:p>
-    <w:p>
-      <w:pPr>
-        <w:pStyle w:val="BodyText"/>
-        <w:spacing w:line="480" w:lineRule="auto" w:after="0" w:before="0"/>
-      </w:pPr>
-      <w:r>
-        <w:rPr>
-          <w:rFonts w:ascii="Times New Roman" w:hAnsi="Times New Roman" w:eastAsia="Times New Roman"/>
-          <w:sz w:val="24"/>
-        </w:rPr>
-        <w:t xml:space="preserve">[3] Emami P, Sahu A, Graf P. BuildingsBench: A Large-Scale Dataset of 900K Buildings and Benchmark for Short-Term Load Forecasting. Adv Neural Inf Process Syst 2023;36.</w:t>
-      </w:r>
-    </w:p>
-    <w:p>
-      <w:pPr>
-        <w:pStyle w:val="BodyText"/>
-        <w:spacing w:line="480" w:lineRule="auto" w:after="0" w:before="0"/>
-      </w:pPr>
-      <w:r>
-        <w:rPr>
-          <w:rFonts w:ascii="Times New Roman" w:hAnsi="Times New Roman" w:eastAsia="Times New Roman"/>
-          <w:sz w:val="24"/>
-        </w:rPr>
-        <w:t xml:space="preserve">[4] Wilson E, et al. End-Use Load Profiles for the U.S. Building Stock. Golden (CO): National Renewable Energy Laboratory; 2022. Report No.: NREL/TP-5500-80889.</w:t>
-      </w:r>
-    </w:p>
-    <w:p>
-      <w:pPr>
-        <w:pStyle w:val="BodyText"/>
-        <w:spacing w:line="480" w:lineRule="auto" w:after="0" w:before="0"/>
-      </w:pPr>
-      <w:r>
-        <w:rPr>
-          <w:rFonts w:ascii="Times New Roman" w:hAnsi="Times New Roman" w:eastAsia="Times New Roman"/>
-          <w:sz w:val="24"/>
-        </w:rPr>
-        <w:t xml:space="preserve">[5] Shi J, et al. Scaling Law for Time Series Forecasting. Adv Neural Inf Process Syst 2024;37.</w:t>
-      </w:r>
-    </w:p>
-    <w:p>
-      <w:pPr>
-        <w:pStyle w:val="BodyText"/>
-        <w:spacing w:line="480" w:lineRule="auto" w:after="0" w:before="0"/>
-      </w:pPr>
-      <w:r>
-        <w:rPr>
-          <w:rFonts w:ascii="Times New Roman" w:hAnsi="Times New Roman" w:eastAsia="Times New Roman"/>
-          <w:sz w:val="24"/>
-        </w:rPr>
-        <w:t xml:space="preserve">[6] Liu X, et al. MOIRAI-MoE: Empowering Time Series Foundation Models with Sparse Mixture of Experts. Proc Mach Learn Res 2025;267:38940–62.</w:t>
-      </w:r>
-    </w:p>
-    <w:p>
-      <w:pPr>
-        <w:pStyle w:val="BodyText"/>
-        <w:spacing w:line="480" w:lineRule="auto" w:after="0" w:before="0"/>
-      </w:pPr>
-      <w:r>
-        <w:rPr>
-          <w:rFonts w:ascii="Times New Roman" w:hAnsi="Times New Roman" w:eastAsia="Times New Roman"/>
-          <w:sz w:val="24"/>
-        </w:rPr>
-        <w:t xml:space="preserve">[7] Zha D, et al. Data-centric AI: Perspectives and Challenges. Proc SIAM Int Conf Data Min; 2023. p. 945–8.</w:t>
-      </w:r>
-    </w:p>
-    <w:p>
-      <w:pPr>
-        <w:pStyle w:val="BodyText"/>
-        <w:spacing w:line="480" w:lineRule="auto" w:after="0" w:before="0"/>
-      </w:pPr>
-      <w:r>
-        <w:rPr>
-          <w:rFonts w:ascii="Times New Roman" w:hAnsi="Times New Roman" w:eastAsia="Times New Roman"/>
-          <w:sz w:val="24"/>
-        </w:rPr>
-        <w:t xml:space="preserve">[8] Kim T, et al. Reversible Instance Normalization for Accurate Time-Series Forecasting against Distribution Shift. Int Conf Learn Represent; 2022.</w:t>
-      </w:r>
-    </w:p>
-    <w:p>
-      <w:pPr>
-        <w:pStyle w:val="BodyText"/>
-        <w:spacing w:line="480" w:lineRule="auto" w:after="0" w:before="0"/>
-      </w:pPr>
-      <w:r>
-        <w:rPr>
-          <w:rFonts w:ascii="Times New Roman" w:hAnsi="Times New Roman" w:eastAsia="Times New Roman"/>
-          <w:sz w:val="24"/>
-        </w:rPr>
-        <w:t xml:space="preserve">[9] Amasyali K, El-Gohary NM. A review of data-driven building energy consumption prediction studies. Renew Sustain Energy Rev 2018;81:1192–205.</w:t>
-      </w:r>
-    </w:p>
-    <w:p>
-      <w:pPr>
-        <w:pStyle w:val="BodyText"/>
-        <w:spacing w:line="480" w:lineRule="auto" w:after="0" w:before="0"/>
-      </w:pPr>
-      <w:r>
-        <w:rPr>
-          <w:rFonts w:ascii="Times New Roman" w:hAnsi="Times New Roman" w:eastAsia="Times New Roman"/>
-          <w:sz w:val="24"/>
-        </w:rPr>
-        <w:t xml:space="preserve">[10] Chen T, Guestrin C. XGBoost: A Scalable Tree Boosting System. Proc 22nd ACM SIGKDD Int Conf Knowl Discov Data Min; 2016. p. 785–94.</w:t>
-      </w:r>
-    </w:p>
-    <w:p>
-      <w:pPr>
-        <w:pStyle w:val="BodyText"/>
-        <w:spacing w:line="480" w:lineRule="auto" w:after="0" w:before="0"/>
-      </w:pPr>
-      <w:r>
-        <w:rPr>
-          <w:rFonts w:ascii="Times New Roman" w:hAnsi="Times New Roman" w:eastAsia="Times New Roman"/>
-          <w:sz w:val="24"/>
-        </w:rPr>
-        <w:t xml:space="preserve">[11] Hochreiter S, Schmidhuber J. Long Short-Term Memory. Neural Comput 1997;9(8):1735–80.</w:t>
-      </w:r>
-    </w:p>
-    <w:p>
-      <w:pPr>
-        <w:pStyle w:val="BodyText"/>
-        <w:spacing w:line="480" w:lineRule="auto" w:after="0" w:before="0"/>
-      </w:pPr>
-      <w:r>
-        <w:rPr>
-          <w:rFonts w:ascii="Times New Roman" w:hAnsi="Times New Roman" w:eastAsia="Times New Roman"/>
-          <w:sz w:val="24"/>
-        </w:rPr>
-        <w:t xml:space="preserve">[12] Vaswani A, et al. Attention Is All You Need. Adv Neural Inf Process Syst 2017;30.</w:t>
-      </w:r>
-    </w:p>
-    <w:p>
-      <w:pPr>
-        <w:pStyle w:val="BodyText"/>
-        <w:spacing w:line="480" w:lineRule="auto" w:after="0" w:before="0"/>
-      </w:pPr>
-      <w:r>
-        <w:rPr>
-          <w:rFonts w:ascii="Times New Roman" w:hAnsi="Times New Roman" w:eastAsia="Times New Roman"/>
-          <w:sz w:val="24"/>
-        </w:rPr>
-        <w:t xml:space="preserve">[13] Nie Y, et al. A Time Series is Worth 64 Words: Long-term Forecasting with Transformers. Int Conf Learn Represent; 2023.</w:t>
-      </w:r>
-    </w:p>
-    <w:p>
-      <w:pPr>
-        <w:pStyle w:val="BodyText"/>
-        <w:spacing w:line="480" w:lineRule="auto" w:after="0" w:before="0"/>
-      </w:pPr>
-      <w:r>
-        <w:rPr>
-          <w:rFonts w:ascii="Times New Roman" w:hAnsi="Times New Roman" w:eastAsia="Times New Roman"/>
-          <w:sz w:val="24"/>
-        </w:rPr>
-        <w:t xml:space="preserve">[14] Ribeiro M, et al. Transfer learning with seasonal and trend adjustment for cross-building energy forecasting. Energy Build 2018;165:352–63.</w:t>
-      </w:r>
-    </w:p>
-    <w:p>
-      <w:pPr>
-        <w:pStyle w:val="BodyText"/>
-        <w:spacing w:line="480" w:lineRule="auto" w:after="0" w:before="0"/>
-      </w:pPr>
-      <w:r>
-        <w:rPr>
-          <w:rFonts w:ascii="Times New Roman" w:hAnsi="Times New Roman" w:eastAsia="Times New Roman"/>
-          <w:sz w:val="24"/>
-        </w:rPr>
-        <w:t xml:space="preserve">[15] Spencer R, et al. Transfer Learning on Transformers for Building Energy Consumption Forecasting — A Comparative Study. Energy Build 2025;336:115632.</w:t>
-      </w:r>
-    </w:p>
-    <w:p>
-      <w:pPr>
-        <w:pStyle w:val="BodyText"/>
-        <w:spacing w:line="480" w:lineRule="auto" w:after="0" w:before="0"/>
-      </w:pPr>
-      <w:r>
-        <w:rPr>
-          <w:rFonts w:ascii="Times New Roman" w:hAnsi="Times New Roman" w:eastAsia="Times New Roman"/>
-          <w:sz w:val="24"/>
-        </w:rPr>
-        <w:t xml:space="preserve">[16] Das A, et al. A decoder-only foundation model for time-series forecasting. Proc Mach Learn Res 2024;235:10148–67.</w:t>
-      </w:r>
-    </w:p>
-    <w:p>
-      <w:pPr>
-        <w:pStyle w:val="BodyText"/>
-        <w:spacing w:line="480" w:lineRule="auto" w:after="0" w:before="0"/>
-      </w:pPr>
-      <w:r>
-        <w:rPr>
-          <w:rFonts w:ascii="Times New Roman" w:hAnsi="Times New Roman" w:eastAsia="Times New Roman"/>
-          <w:sz w:val="24"/>
-        </w:rPr>
-        <w:t xml:space="preserve">[17] Ansari AF, et al. Chronos: Learning the Language of Time Series. Trans Mach Learn Res 2024.</w:t>
-      </w:r>
-    </w:p>
-    <w:p>
-      <w:pPr>
-        <w:pStyle w:val="BodyText"/>
-        <w:spacing w:line="480" w:lineRule="auto" w:after="0" w:before="0"/>
-      </w:pPr>
-      <w:r>
-        <w:rPr>
-          <w:rFonts w:ascii="Times New Roman" w:hAnsi="Times New Roman" w:eastAsia="Times New Roman"/>
-          <w:sz w:val="24"/>
-        </w:rPr>
-        <w:t xml:space="preserve">[18] Rasul K, et al. Lag-Llama: Towards Foundation Models for Probabilistic Time Series Forecasting. NeurIPS Workshop Robustness Found Models; 2023.</w:t>
-      </w:r>
-    </w:p>
-    <w:p>
-      <w:pPr>
-        <w:pStyle w:val="BodyText"/>
-        <w:spacing w:line="480" w:lineRule="auto" w:after="0" w:before="0"/>
-      </w:pPr>
-      <w:r>
-        <w:rPr>
-          <w:rFonts w:ascii="Times New Roman" w:hAnsi="Times New Roman" w:eastAsia="Times New Roman"/>
-          <w:sz w:val="24"/>
-        </w:rPr>
-        <w:t xml:space="preserve">[19] Woo G, et al. Unified Training of Universal Time Series Forecasting Transformers. Proc Mach Learn Res 2024;235:53140–64.</w:t>
-      </w:r>
-    </w:p>
-    <w:p>
-      <w:pPr>
-        <w:pStyle w:val="BodyText"/>
-        <w:spacing w:line="480" w:lineRule="auto" w:after="0" w:before="0"/>
-      </w:pPr>
-      <w:r>
-        <w:rPr>
-          <w:rFonts w:ascii="Times New Roman" w:hAnsi="Times New Roman" w:eastAsia="Times New Roman"/>
-          <w:sz w:val="24"/>
-        </w:rPr>
-        <w:t xml:space="preserve">[20] Yao Q, et al. Towards Neural Scaling Laws for Time Series Foundation Models. Int Conf Learn Represent; 2025.</w:t>
-      </w:r>
-    </w:p>
-    <w:p>
-      <w:pPr>
-        <w:pStyle w:val="BodyText"/>
-        <w:spacing w:line="480" w:lineRule="auto" w:after="0" w:before="0"/>
-      </w:pPr>
-      <w:r>
-        <w:rPr>
-          <w:rFonts w:ascii="Times New Roman" w:hAnsi="Times New Roman" w:eastAsia="Times New Roman"/>
-          <w:sz w:val="24"/>
-        </w:rPr>
-        <w:t xml:space="preserve">[21] Crawley DB, et al. EnergyPlus: creating a new-generation building energy simulation program. Energy Build 2001;33(4):319–31.</w:t>
-      </w:r>
-    </w:p>
-    <w:p>
-      <w:pPr>
-        <w:pStyle w:val="BodyText"/>
-        <w:spacing w:line="480" w:lineRule="auto" w:after="0" w:before="0"/>
-      </w:pPr>
-      <w:r>
-        <w:rPr>
-          <w:rFonts w:ascii="Times New Roman" w:hAnsi="Times New Roman" w:eastAsia="Times New Roman"/>
-          <w:sz w:val="24"/>
-        </w:rPr>
-        <w:t xml:space="preserve">[22] Deru M, et al. U.S. Department of Energy Commercial Reference Building Models of the National Building Stock. Golden (CO): National Renewable Energy Laboratory; 2011. Report No.: NREL/TP-5500-46861.</w:t>
-      </w:r>
-    </w:p>
-    <w:p>
-      <w:pPr>
-        <w:pStyle w:val="BodyText"/>
-        <w:spacing w:line="480" w:lineRule="auto" w:after="0" w:before="0"/>
-      </w:pPr>
-      <w:r>
-        <w:rPr>
-          <w:rFonts w:ascii="Times New Roman" w:hAnsi="Times New Roman" w:eastAsia="Times New Roman"/>
-          <w:sz w:val="24"/>
-        </w:rPr>
-        <w:t xml:space="preserve">[23] McKay MD, Beckman RJ, Conover WJ. A Comparison of Three Methods for Selecting Values of Input Variables in the Analysis of Output from a Computer Code. Technometrics 1979;21(2):239–45.</w:t>
-      </w:r>
-    </w:p>
-    <w:p>
-      <w:pPr>
-        <w:pStyle w:val="BodyText"/>
-        <w:spacing w:line="480" w:lineRule="auto" w:after="0" w:before="0"/>
-      </w:pPr>
-      <w:r>
-        <w:rPr>
-          <w:rFonts w:ascii="Times New Roman" w:hAnsi="Times New Roman" w:eastAsia="Times New Roman"/>
-          <w:sz w:val="24"/>
-        </w:rPr>
-        <w:t xml:space="preserve">[24] Box GEP, Cox DR. An Analysis of Transformations. J R Stat Soc B 1964;26(2):211–52.</w:t>
-      </w:r>
-    </w:p>
-    <w:p>
-      <w:pPr>
-        <w:pStyle w:val="BodyText"/>
-        <w:spacing w:line="480" w:lineRule="auto" w:after="0" w:before="0"/>
-      </w:pPr>
-      <w:r>
-        <w:rPr>
-          <w:rFonts w:ascii="Times New Roman" w:hAnsi="Times New Roman" w:eastAsia="Times New Roman"/>
-          <w:sz w:val="24"/>
-        </w:rPr>
-        <w:t xml:space="preserve">[25] Loshchilov I, Hutter F. Decoupled Weight Decay Regularization. Int Conf Learn Represent; 2019.</w:t>
-      </w:r>
-    </w:p>
-    <w:p>
-      <w:pPr>
-        <w:pStyle w:val="BodyText"/>
-        <w:spacing w:line="480" w:lineRule="auto" w:after="0" w:before="0"/>
-      </w:pPr>
-      <w:r>
-        <w:rPr>
-          <w:rFonts w:ascii="Times New Roman" w:hAnsi="Times New Roman" w:eastAsia="Times New Roman"/>
-          <w:sz w:val="24"/>
-        </w:rPr>
-        <w:t xml:space="preserve">[26] Miller C, et al. The Building Data Genome Project 2, energy meter data from the ASHRAE Great Energy Predictor III competition. Sci Data 2020;7:368.</w:t>
-      </w:r>
-    </w:p>
-    <w:p>
-      <w:pPr>
-        <w:pStyle w:val="BodyText"/>
-        <w:spacing w:line="480" w:lineRule="auto" w:after="0" w:before="0"/>
-      </w:pPr>
-      <w:r>
-        <w:rPr>
-          <w:rFonts w:ascii="Times New Roman" w:hAnsi="Times New Roman" w:eastAsia="Times New Roman"/>
-          <w:sz w:val="24"/>
-        </w:rPr>
-        <w:t xml:space="preserve">[27] Trindade A. ElectricityLoadDiagrams20112014 [dataset]. UCI Machine Learning Repository; 2015.</w:t>
+        <w:t xml:space="preserve">During the preparation of this work the author used Claude (Anthropic) in order to assist with code development for simulation post-processing, figure generation scripts, and manuscript formatting (Markdown-to-DOCX conversion). After using this tool, the author reviewed and edited the content as needed and takes full responsibility for the content of the published article.</w:t>
       </w:r>
     </w:p>
     <w:p>
@@ -6669,7 +6331,7 @@
       </w:r>
     </w:p>
     <w:bookmarkEnd w:id="36"/>
-    <w:bookmarkStart w:id="42" w:name="appendix-a-multi-seed-results"/>
+    <w:bookmarkStart w:id="37" w:name="references"/>
     <w:p>
       <w:pPr>
         <w:pStyle w:val="Heading2"/>
@@ -6683,10 +6345,393 @@
           <w:i w:val="0"/>
           <w:sz w:val="26"/>
         </w:rPr>
+        <w:t xml:space="preserve">References</w:t>
+      </w:r>
+    </w:p>
+    <w:p>
+      <w:pPr>
+        <w:pStyle w:val="FirstParagraph"/>
+        <w:spacing w:line="480" w:lineRule="auto" w:after="0" w:before="0"/>
+      </w:pPr>
+      <w:r>
+        <w:rPr>
+          <w:rFonts w:ascii="Times New Roman" w:hAnsi="Times New Roman" w:eastAsia="Times New Roman"/>
+          <w:sz w:val="24"/>
+        </w:rPr>
+        <w:t xml:space="preserve">[1] Fan C, et al. A short-term building cooling load prediction method using deep learning algorithms. Appl Energy 2017;195:222–33.</w:t>
+      </w:r>
+    </w:p>
+    <w:p>
+      <w:pPr>
+        <w:pStyle w:val="BodyText"/>
+        <w:spacing w:line="480" w:lineRule="auto" w:after="0" w:before="0"/>
+      </w:pPr>
+      <w:r>
+        <w:rPr>
+          <w:rFonts w:ascii="Times New Roman" w:hAnsi="Times New Roman" w:eastAsia="Times New Roman"/>
+          <w:sz w:val="24"/>
+        </w:rPr>
+        <w:t xml:space="preserve">[2] Hong T, et al. Ten questions on urban building energy modeling. Build Environ 2019;168:106508.</w:t>
+      </w:r>
+    </w:p>
+    <w:p>
+      <w:pPr>
+        <w:pStyle w:val="BodyText"/>
+        <w:spacing w:line="480" w:lineRule="auto" w:after="0" w:before="0"/>
+      </w:pPr>
+      <w:r>
+        <w:rPr>
+          <w:rFonts w:ascii="Times New Roman" w:hAnsi="Times New Roman" w:eastAsia="Times New Roman"/>
+          <w:sz w:val="24"/>
+        </w:rPr>
+        <w:t xml:space="preserve">[3] Emami P, Sahu A, Graf P. BuildingsBench: A Large-Scale Dataset of 900K Buildings and Benchmark for Short-Term Load Forecasting. Adv Neural Inf Process Syst 2023;36.</w:t>
+      </w:r>
+    </w:p>
+    <w:p>
+      <w:pPr>
+        <w:pStyle w:val="BodyText"/>
+        <w:spacing w:line="480" w:lineRule="auto" w:after="0" w:before="0"/>
+      </w:pPr>
+      <w:r>
+        <w:rPr>
+          <w:rFonts w:ascii="Times New Roman" w:hAnsi="Times New Roman" w:eastAsia="Times New Roman"/>
+          <w:sz w:val="24"/>
+        </w:rPr>
+        <w:t xml:space="preserve">[4] Wilson E, et al. End-Use Load Profiles for the U.S. Building Stock. Golden (CO): National Renewable Energy Laboratory; 2022. Report No.: NREL/TP-5500-80889.</w:t>
+      </w:r>
+    </w:p>
+    <w:p>
+      <w:pPr>
+        <w:pStyle w:val="BodyText"/>
+        <w:spacing w:line="480" w:lineRule="auto" w:after="0" w:before="0"/>
+      </w:pPr>
+      <w:r>
+        <w:rPr>
+          <w:rFonts w:ascii="Times New Roman" w:hAnsi="Times New Roman" w:eastAsia="Times New Roman"/>
+          <w:sz w:val="24"/>
+        </w:rPr>
+        <w:t xml:space="preserve">[5] Shi J, et al. Scaling Law for Time Series Forecasting. Adv Neural Inf Process Syst 2024;37.</w:t>
+      </w:r>
+    </w:p>
+    <w:p>
+      <w:pPr>
+        <w:pStyle w:val="BodyText"/>
+        <w:spacing w:line="480" w:lineRule="auto" w:after="0" w:before="0"/>
+      </w:pPr>
+      <w:r>
+        <w:rPr>
+          <w:rFonts w:ascii="Times New Roman" w:hAnsi="Times New Roman" w:eastAsia="Times New Roman"/>
+          <w:sz w:val="24"/>
+        </w:rPr>
+        <w:t xml:space="preserve">[6] Liu X, et al. MOIRAI-MoE: Empowering Time Series Foundation Models with Sparse Mixture of Experts. Proc Mach Learn Res 2025;267:38940–62.</w:t>
+      </w:r>
+    </w:p>
+    <w:p>
+      <w:pPr>
+        <w:pStyle w:val="BodyText"/>
+        <w:spacing w:line="480" w:lineRule="auto" w:after="0" w:before="0"/>
+      </w:pPr>
+      <w:r>
+        <w:rPr>
+          <w:rFonts w:ascii="Times New Roman" w:hAnsi="Times New Roman" w:eastAsia="Times New Roman"/>
+          <w:sz w:val="24"/>
+        </w:rPr>
+        <w:t xml:space="preserve">[7] Zha D, et al. Data-centric AI: Perspectives and Challenges. Proc SIAM Int Conf Data Min; 2023. p. 945–8.</w:t>
+      </w:r>
+    </w:p>
+    <w:p>
+      <w:pPr>
+        <w:pStyle w:val="BodyText"/>
+        <w:spacing w:line="480" w:lineRule="auto" w:after="0" w:before="0"/>
+      </w:pPr>
+      <w:r>
+        <w:rPr>
+          <w:rFonts w:ascii="Times New Roman" w:hAnsi="Times New Roman" w:eastAsia="Times New Roman"/>
+          <w:sz w:val="24"/>
+        </w:rPr>
+        <w:t xml:space="preserve">[8] Kim T, et al. Reversible Instance Normalization for Accurate Time-Series Forecasting against Distribution Shift. Int Conf Learn Represent; 2022.</w:t>
+      </w:r>
+    </w:p>
+    <w:p>
+      <w:pPr>
+        <w:pStyle w:val="BodyText"/>
+        <w:spacing w:line="480" w:lineRule="auto" w:after="0" w:before="0"/>
+      </w:pPr>
+      <w:r>
+        <w:rPr>
+          <w:rFonts w:ascii="Times New Roman" w:hAnsi="Times New Roman" w:eastAsia="Times New Roman"/>
+          <w:sz w:val="24"/>
+        </w:rPr>
+        <w:t xml:space="preserve">[9] Amasyali K, El-Gohary NM. A review of data-driven building energy consumption prediction studies. Renew Sustain Energy Rev 2018;81:1192–205.</w:t>
+      </w:r>
+    </w:p>
+    <w:p>
+      <w:pPr>
+        <w:pStyle w:val="BodyText"/>
+        <w:spacing w:line="480" w:lineRule="auto" w:after="0" w:before="0"/>
+      </w:pPr>
+      <w:r>
+        <w:rPr>
+          <w:rFonts w:ascii="Times New Roman" w:hAnsi="Times New Roman" w:eastAsia="Times New Roman"/>
+          <w:sz w:val="24"/>
+        </w:rPr>
+        <w:t xml:space="preserve">[10] Chen T, Guestrin C. XGBoost: A Scalable Tree Boosting System. Proc 22nd ACM SIGKDD Int Conf Knowl Discov Data Min; 2016. p. 785–94.</w:t>
+      </w:r>
+    </w:p>
+    <w:p>
+      <w:pPr>
+        <w:pStyle w:val="BodyText"/>
+        <w:spacing w:line="480" w:lineRule="auto" w:after="0" w:before="0"/>
+      </w:pPr>
+      <w:r>
+        <w:rPr>
+          <w:rFonts w:ascii="Times New Roman" w:hAnsi="Times New Roman" w:eastAsia="Times New Roman"/>
+          <w:sz w:val="24"/>
+        </w:rPr>
+        <w:t xml:space="preserve">[11] Hochreiter S, Schmidhuber J. Long Short-Term Memory. Neural Comput 1997;9(8):1735–80.</w:t>
+      </w:r>
+    </w:p>
+    <w:p>
+      <w:pPr>
+        <w:pStyle w:val="BodyText"/>
+        <w:spacing w:line="480" w:lineRule="auto" w:after="0" w:before="0"/>
+      </w:pPr>
+      <w:r>
+        <w:rPr>
+          <w:rFonts w:ascii="Times New Roman" w:hAnsi="Times New Roman" w:eastAsia="Times New Roman"/>
+          <w:sz w:val="24"/>
+        </w:rPr>
+        <w:t xml:space="preserve">[12] Vaswani A, et al. Attention Is All You Need. Adv Neural Inf Process Syst 2017;30.</w:t>
+      </w:r>
+    </w:p>
+    <w:p>
+      <w:pPr>
+        <w:pStyle w:val="BodyText"/>
+        <w:spacing w:line="480" w:lineRule="auto" w:after="0" w:before="0"/>
+      </w:pPr>
+      <w:r>
+        <w:rPr>
+          <w:rFonts w:ascii="Times New Roman" w:hAnsi="Times New Roman" w:eastAsia="Times New Roman"/>
+          <w:sz w:val="24"/>
+        </w:rPr>
+        <w:t xml:space="preserve">[13] Nie Y, et al. A Time Series is Worth 64 Words: Long-term Forecasting with Transformers. Int Conf Learn Represent; 2023.</w:t>
+      </w:r>
+    </w:p>
+    <w:p>
+      <w:pPr>
+        <w:pStyle w:val="BodyText"/>
+        <w:spacing w:line="480" w:lineRule="auto" w:after="0" w:before="0"/>
+      </w:pPr>
+      <w:r>
+        <w:rPr>
+          <w:rFonts w:ascii="Times New Roman" w:hAnsi="Times New Roman" w:eastAsia="Times New Roman"/>
+          <w:sz w:val="24"/>
+        </w:rPr>
+        <w:t xml:space="preserve">[14] Ribeiro M, et al. Transfer learning with seasonal and trend adjustment for cross-building energy forecasting. Energy Build 2018;165:352–63.</w:t>
+      </w:r>
+    </w:p>
+    <w:p>
+      <w:pPr>
+        <w:pStyle w:val="BodyText"/>
+        <w:spacing w:line="480" w:lineRule="auto" w:after="0" w:before="0"/>
+      </w:pPr>
+      <w:r>
+        <w:rPr>
+          <w:rFonts w:ascii="Times New Roman" w:hAnsi="Times New Roman" w:eastAsia="Times New Roman"/>
+          <w:sz w:val="24"/>
+        </w:rPr>
+        <w:t xml:space="preserve">[15] Spencer R, et al. Transfer Learning on Transformers for Building Energy Consumption Forecasting — A Comparative Study. Energy Build 2025;336:115632.</w:t>
+      </w:r>
+    </w:p>
+    <w:p>
+      <w:pPr>
+        <w:pStyle w:val="BodyText"/>
+        <w:spacing w:line="480" w:lineRule="auto" w:after="0" w:before="0"/>
+      </w:pPr>
+      <w:r>
+        <w:rPr>
+          <w:rFonts w:ascii="Times New Roman" w:hAnsi="Times New Roman" w:eastAsia="Times New Roman"/>
+          <w:sz w:val="24"/>
+        </w:rPr>
+        <w:t xml:space="preserve">[16] Das A, et al. A decoder-only foundation model for time-series forecasting. Proc Mach Learn Res 2024;235:10148–67.</w:t>
+      </w:r>
+    </w:p>
+    <w:p>
+      <w:pPr>
+        <w:pStyle w:val="BodyText"/>
+        <w:spacing w:line="480" w:lineRule="auto" w:after="0" w:before="0"/>
+      </w:pPr>
+      <w:r>
+        <w:rPr>
+          <w:rFonts w:ascii="Times New Roman" w:hAnsi="Times New Roman" w:eastAsia="Times New Roman"/>
+          <w:sz w:val="24"/>
+        </w:rPr>
+        <w:t xml:space="preserve">[17] Ansari AF, et al. Chronos: Learning the Language of Time Series. Trans Mach Learn Res 2024.</w:t>
+      </w:r>
+    </w:p>
+    <w:p>
+      <w:pPr>
+        <w:pStyle w:val="BodyText"/>
+        <w:spacing w:line="480" w:lineRule="auto" w:after="0" w:before="0"/>
+      </w:pPr>
+      <w:r>
+        <w:rPr>
+          <w:rFonts w:ascii="Times New Roman" w:hAnsi="Times New Roman" w:eastAsia="Times New Roman"/>
+          <w:sz w:val="24"/>
+        </w:rPr>
+        <w:t xml:space="preserve">[18] Rasul K, et al. Lag-Llama: Towards Foundation Models for Probabilistic Time Series Forecasting. NeurIPS Workshop Robustness Found Models; 2023.</w:t>
+      </w:r>
+    </w:p>
+    <w:p>
+      <w:pPr>
+        <w:pStyle w:val="BodyText"/>
+        <w:spacing w:line="480" w:lineRule="auto" w:after="0" w:before="0"/>
+      </w:pPr>
+      <w:r>
+        <w:rPr>
+          <w:rFonts w:ascii="Times New Roman" w:hAnsi="Times New Roman" w:eastAsia="Times New Roman"/>
+          <w:sz w:val="24"/>
+        </w:rPr>
+        <w:t xml:space="preserve">[19] Woo G, et al. Unified Training of Universal Time Series Forecasting Transformers. Proc Mach Learn Res 2024;235:53140–64.</w:t>
+      </w:r>
+    </w:p>
+    <w:p>
+      <w:pPr>
+        <w:pStyle w:val="BodyText"/>
+        <w:spacing w:line="480" w:lineRule="auto" w:after="0" w:before="0"/>
+      </w:pPr>
+      <w:r>
+        <w:rPr>
+          <w:rFonts w:ascii="Times New Roman" w:hAnsi="Times New Roman" w:eastAsia="Times New Roman"/>
+          <w:sz w:val="24"/>
+        </w:rPr>
+        <w:t xml:space="preserve">[20] Yao Q, et al. Towards Neural Scaling Laws for Time Series Foundation Models. Int Conf Learn Represent; 2025.</w:t>
+      </w:r>
+    </w:p>
+    <w:p>
+      <w:pPr>
+        <w:pStyle w:val="BodyText"/>
+        <w:spacing w:line="480" w:lineRule="auto" w:after="0" w:before="0"/>
+      </w:pPr>
+      <w:r>
+        <w:rPr>
+          <w:rFonts w:ascii="Times New Roman" w:hAnsi="Times New Roman" w:eastAsia="Times New Roman"/>
+          <w:sz w:val="24"/>
+        </w:rPr>
+        <w:t xml:space="preserve">[21] Crawley DB, et al. EnergyPlus: creating a new-generation building energy simulation program. Energy Build 2001;33(4):319–31.</w:t>
+      </w:r>
+    </w:p>
+    <w:p>
+      <w:pPr>
+        <w:pStyle w:val="BodyText"/>
+        <w:spacing w:line="480" w:lineRule="auto" w:after="0" w:before="0"/>
+      </w:pPr>
+      <w:r>
+        <w:rPr>
+          <w:rFonts w:ascii="Times New Roman" w:hAnsi="Times New Roman" w:eastAsia="Times New Roman"/>
+          <w:sz w:val="24"/>
+        </w:rPr>
+        <w:t xml:space="preserve">[22] Deru M, et al. U.S. Department of Energy Commercial Reference Building Models of the National Building Stock. Golden (CO): National Renewable Energy Laboratory; 2011. Report No.: NREL/TP-5500-46861.</w:t>
+      </w:r>
+    </w:p>
+    <w:p>
+      <w:pPr>
+        <w:pStyle w:val="BodyText"/>
+        <w:spacing w:line="480" w:lineRule="auto" w:after="0" w:before="0"/>
+      </w:pPr>
+      <w:r>
+        <w:rPr>
+          <w:rFonts w:ascii="Times New Roman" w:hAnsi="Times New Roman" w:eastAsia="Times New Roman"/>
+          <w:sz w:val="24"/>
+        </w:rPr>
+        <w:t xml:space="preserve">[23] McKay MD, Beckman RJ, Conover WJ. A Comparison of Three Methods for Selecting Values of Input Variables in the Analysis of Output from a Computer Code. Technometrics 1979;21(2):239–45.</w:t>
+      </w:r>
+    </w:p>
+    <w:p>
+      <w:pPr>
+        <w:pStyle w:val="BodyText"/>
+        <w:spacing w:line="480" w:lineRule="auto" w:after="0" w:before="0"/>
+      </w:pPr>
+      <w:r>
+        <w:rPr>
+          <w:rFonts w:ascii="Times New Roman" w:hAnsi="Times New Roman" w:eastAsia="Times New Roman"/>
+          <w:sz w:val="24"/>
+        </w:rPr>
+        <w:t xml:space="preserve">[24] Box GEP, Cox DR. An Analysis of Transformations. J R Stat Soc B 1964;26(2):211–52.</w:t>
+      </w:r>
+    </w:p>
+    <w:p>
+      <w:pPr>
+        <w:pStyle w:val="BodyText"/>
+        <w:spacing w:line="480" w:lineRule="auto" w:after="0" w:before="0"/>
+      </w:pPr>
+      <w:r>
+        <w:rPr>
+          <w:rFonts w:ascii="Times New Roman" w:hAnsi="Times New Roman" w:eastAsia="Times New Roman"/>
+          <w:sz w:val="24"/>
+        </w:rPr>
+        <w:t xml:space="preserve">[25] Loshchilov I, Hutter F. Decoupled Weight Decay Regularization. Int Conf Learn Represent; 2019.</w:t>
+      </w:r>
+    </w:p>
+    <w:p>
+      <w:pPr>
+        <w:pStyle w:val="BodyText"/>
+        <w:spacing w:line="480" w:lineRule="auto" w:after="0" w:before="0"/>
+      </w:pPr>
+      <w:r>
+        <w:rPr>
+          <w:rFonts w:ascii="Times New Roman" w:hAnsi="Times New Roman" w:eastAsia="Times New Roman"/>
+          <w:sz w:val="24"/>
+        </w:rPr>
+        <w:t xml:space="preserve">[26] Miller C, et al. The Building Data Genome Project 2, energy meter data from the ASHRAE Great Energy Predictor III competition. Sci Data 2020;7:368.</w:t>
+      </w:r>
+    </w:p>
+    <w:p>
+      <w:pPr>
+        <w:pStyle w:val="BodyText"/>
+        <w:spacing w:line="480" w:lineRule="auto" w:after="0" w:before="0"/>
+      </w:pPr>
+      <w:r>
+        <w:rPr>
+          <w:rFonts w:ascii="Times New Roman" w:hAnsi="Times New Roman" w:eastAsia="Times New Roman"/>
+          <w:sz w:val="24"/>
+        </w:rPr>
+        <w:t xml:space="preserve">[27] Trindade A. ElectricityLoadDiagrams20112014 [dataset]. UCI Machine Learning Repository; 2015.</w:t>
+      </w:r>
+    </w:p>
+    <w:p>
+      <w:pPr>
+        <w:spacing w:line="480" w:lineRule="auto" w:after="0" w:before="0"/>
+      </w:pPr>
+      <w:r>
+        <w:rPr>
+          <w:rFonts w:ascii="Times New Roman" w:hAnsi="Times New Roman" w:eastAsia="Times New Roman"/>
+          <w:sz w:val="24"/>
+        </w:rPr>
+        <w:pict>
+          <v:rect style="width:0;height:1.5pt" o:hralign="center" o:hrstd="t" o:hr="t"/>
+        </w:pict>
+      </w:r>
+    </w:p>
+    <w:bookmarkEnd w:id="37"/>
+    <w:bookmarkStart w:id="43" w:name="appendix-a-multi-seed-results"/>
+    <w:p>
+      <w:pPr>
+        <w:pStyle w:val="Heading2"/>
+        <w:keepNext/>
+        <w:spacing w:line="480" w:lineRule="auto" w:after="60" w:before="120"/>
+      </w:pPr>
+      <w:r>
+        <w:rPr>
+          <w:rFonts w:ascii="Times New Roman" w:hAnsi="Times New Roman" w:eastAsia="Times New Roman"/>
+          <w:b/>
+          <w:i w:val="0"/>
+          <w:sz w:val="26"/>
+        </w:rPr>
         <w:t xml:space="preserve">Appendix A: Multi-Seed Results</w:t>
       </w:r>
     </w:p>
-    <w:bookmarkStart w:id="37" w:name="a.1-korean-700-revin-on-s-18000-5-seeds"/>
+    <w:bookmarkStart w:id="38" w:name="a.1-korean-700-revin-on-s-18000-5-seeds"/>
     <w:p>
       <w:pPr>
         <w:pStyle w:val="Heading3"/>
@@ -7114,8 +7159,8 @@
         <w:t xml:space="preserve">‡ Four-seed mean (seeds 42, 43, 44, 46); seed 45 NCRPS not evaluated with the retrained checkpoint used for NRMSE.</w:t>
       </w:r>
     </w:p>
-    <w:bookmarkEnd w:id="37"/>
-    <w:bookmarkStart w:id="38" w:name="a.2-korean-700-revin-off-s-18000-3-seeds"/>
+    <w:bookmarkEnd w:id="38"/>
+    <w:bookmarkStart w:id="39" w:name="a.2-korean-700-revin-off-s-18000-3-seeds"/>
     <w:p>
       <w:pPr>
         <w:spacing w:line="480" w:lineRule="auto" w:after="0" w:before="0"/>
@@ -7442,8 +7487,8 @@
         <w:t xml:space="preserve">§ Two-seed mean (seeds 42, 44); seed 43 NCRPS not evaluated due to broken original checkpoint.</w:t>
       </w:r>
     </w:p>
-    <w:bookmarkEnd w:id="38"/>
-    <w:bookmarkStart w:id="39" w:name="a.3-korean-700-revin-on-s-16000-5-seeds"/>
+    <w:bookmarkEnd w:id="39"/>
+    <w:bookmarkStart w:id="40" w:name="a.3-korean-700-revin-on-s-16000-5-seeds"/>
     <w:p>
       <w:pPr>
         <w:spacing w:line="480" w:lineRule="auto" w:after="0" w:before="0"/>
@@ -7754,8 +7799,8 @@
         <w:spacing w:line="480" w:lineRule="auto" w:after="0" w:before="0"/>
       </w:pPr>
     </w:p>
-    <w:bookmarkEnd w:id="39"/>
-    <w:bookmarkStart w:id="40" w:name="X19de30977b2efbcd7dd418f1d5e794ff568bf73"/>
+    <w:bookmarkEnd w:id="40"/>
+    <w:bookmarkStart w:id="41" w:name="X19de30977b2efbcd7dd418f1d5e794ff568bf73"/>
     <w:p>
       <w:pPr>
         <w:pStyle w:val="Heading3"/>
@@ -8077,8 +8122,8 @@
         <w:t xml:space="preserve">Augmentation contributes 0.56 pp to NRMSE (13.67% → 13.11%) and 1.02 pp to NCRPS (8.16% → 7.14%).</w:t>
       </w:r>
     </w:p>
-    <w:bookmarkEnd w:id="40"/>
-    <w:bookmarkStart w:id="41" w:name="a.5-bb-900k-revin"/>
+    <w:bookmarkEnd w:id="41"/>
+    <w:bookmarkStart w:id="42" w:name="a.5-bb-900k-revin"/>
     <w:p>
       <w:pPr>
         <w:spacing w:line="480" w:lineRule="auto" w:after="0" w:before="0"/>
@@ -8127,9 +8172,9 @@
         </w:pict>
       </w:r>
     </w:p>
-    <w:bookmarkEnd w:id="41"/>
     <w:bookmarkEnd w:id="42"/>
-    <w:bookmarkStart w:id="43" w:name="appendix-b-bb-700-and-bb-7k-scaling"/>
+    <w:bookmarkEnd w:id="43"/>
+    <w:bookmarkStart w:id="44" w:name="appendix-b-bb-700-and-bb-7k-scaling"/>
     <w:p>
       <w:pPr>
         <w:pStyle w:val="Heading2"/>
@@ -8828,8 +8873,8 @@
         </w:pict>
       </w:r>
     </w:p>
-    <w:bookmarkEnd w:id="43"/>
-    <w:bookmarkStart w:id="44" w:name="X7705841f826405c94727741dedee731c1f88735"/>
+    <w:bookmarkEnd w:id="44"/>
+    <w:bookmarkStart w:id="45" w:name="X7705841f826405c94727741dedee731c1f88735"/>
     <w:p>
       <w:pPr>
         <w:pStyle w:val="Heading2"/>
@@ -9248,8 +9293,8 @@
         </w:pict>
       </w:r>
     </w:p>
-    <w:bookmarkEnd w:id="44"/>
-    <w:bookmarkStart w:id="45" w:name="figures"/>
+    <w:bookmarkEnd w:id="45"/>
+    <w:bookmarkStart w:id="46" w:name="figures"/>
     <w:p>
       <w:pPr>
         <w:pStyle w:val="Heading2"/>
@@ -9550,8 +9595,8 @@
         <w:t xml:space="preserve">RevIN’s regime-dependent effect. Korean-700 bars use five-seed means; BB-700 and BB-900K bars use seed-42 runs. Green arrows indicate lower NRMSE; red indicates degradation.</w:t>
       </w:r>
     </w:p>
-    <w:bookmarkEnd w:id="45"/>
     <w:bookmarkEnd w:id="46"/>
+    <w:bookmarkEnd w:id="47"/>
     <w:sectPr>
       <w:footnotePr>
         <w:numRestart w:val="eachSect"/>

</xml_diff>